<commit_message>
rajout categorie et modification url
</commit_message>
<xml_diff>
--- a/documentation technique.docx
+++ b/documentation technique.docx
@@ -46,10 +46,10 @@
       </w:pPr>
       <w:r>
         <w:drawing>
-          <wp:inline wp14:editId="79BDB98D" wp14:anchorId="0E33FB25">
-            <wp:extent cx="5724525" cy="3924300"/>
+          <wp:inline wp14:editId="7D959745" wp14:anchorId="05F368A8">
+            <wp:extent cx="5724525" cy="2838450"/>
             <wp:effectExtent l="0" t="0" r="0" b="0"/>
-            <wp:docPr id="262243280" name="drawing"/>
+            <wp:docPr id="695350305" name="drawing"/>
             <wp:cNvGraphicFramePr>
               <a:graphicFrameLocks noChangeAspect="1"/>
             </wp:cNvGraphicFramePr>
@@ -57,14 +57,14 @@
               <a:graphicData xmlns:a="http://schemas.openxmlformats.org/drawingml/2006/main" uri="http://schemas.openxmlformats.org/drawingml/2006/picture">
                 <pic:pic xmlns:pic="http://schemas.openxmlformats.org/drawingml/2006/picture">
                   <pic:nvPicPr>
-                    <pic:cNvPr id="262243280" name=""/>
+                    <pic:cNvPr id="695350305" name="Picture 695350305"/>
                     <pic:cNvPicPr/>
                   </pic:nvPicPr>
                   <pic:blipFill>
-                    <a:blip xmlns:r="http://schemas.openxmlformats.org/officeDocument/2006/relationships" r:embed="rId1980461531">
+                    <a:blip xmlns:r="http://schemas.openxmlformats.org/officeDocument/2006/relationships" r:embed="rId295746404">
                       <a:extLst>
-                        <a:ext xmlns:a="http://schemas.openxmlformats.org/drawingml/2006/main" uri="{28A0092B-C50C-407E-A947-70E740481C1C}">
-                          <a14:useLocalDpi xmlns:a14="http://schemas.microsoft.com/office/drawing/2010/main" val="0"/>
+                        <a:ext uri="{28A0092B-C50C-407E-A947-70E740481C1C}">
+                          <a14:useLocalDpi xmlns:a14="http://schemas.microsoft.com/office/drawing/2010/main"/>
                         </a:ext>
                       </a:extLst>
                     </a:blip>
@@ -75,7 +75,7 @@
                   <pic:spPr>
                     <a:xfrm>
                       <a:off x="0" y="0"/>
-                      <a:ext cx="5724525" cy="3924300"/>
+                      <a:ext cx="5724525" cy="2838450"/>
                     </a:xfrm>
                     <a:prstGeom prst="rect">
                       <a:avLst/>
@@ -202,13 +202,37 @@
         <w:rPr>
           <w:lang w:val="fr-FR"/>
         </w:rPr>
-        <w:t>yyyy</w:t>
+        <w:t>categories</w:t>
       </w:r>
       <w:r>
         <w:rPr>
           <w:lang w:val="fr-FR"/>
         </w:rPr>
-        <w:t xml:space="preserve">/mm/dd/slug_id.html (id est celui utiliser pour trouver l’article, le slug </w:t>
+        <w:t>/</w:t>
+      </w:r>
+      <w:r>
+        <w:rPr>
+          <w:lang w:val="fr-FR"/>
+        </w:rPr>
+        <w:t>yyyy</w:t>
+      </w:r>
+      <w:r>
+        <w:rPr>
+          <w:lang w:val="fr-FR"/>
+        </w:rPr>
+        <w:t>/mm/dd/slug_id</w:t>
+      </w:r>
+      <w:r>
+        <w:rPr>
+          <w:lang w:val="fr-FR"/>
+        </w:rPr>
+        <w:t>Article_idCategories</w:t>
+      </w:r>
+      <w:r>
+        <w:rPr>
+          <w:lang w:val="fr-FR"/>
+        </w:rPr>
+        <w:t xml:space="preserve">.html (id est celui utiliser pour trouver l’article, le slug </w:t>
       </w:r>
       <w:r>
         <w:rPr>

</xml_diff>